<commit_message>
test: add e2e education verification (ALL PASSED)
</commit_message>
<xml_diff>
--- a/candidates/Paluch_Dariusz/Populated_CV.docx
+++ b/candidates/Paluch_Dariusz/Populated_CV.docx
@@ -40,7 +40,6 @@
                 <w:color w:val="000000" w:themeColor="text1"/>
                 <w:sz w:val="20"/>
                 <w:szCs w:val="20"/>
-                <w:lang w:eastAsia="de-DE"/>
               </w:rPr>
             </w:pPr>
             <w:r>
@@ -50,7 +49,6 @@
                 <w:color w:val="000000" w:themeColor="text1"/>
                 <w:sz w:val="20"/>
                 <w:szCs w:val="20"/>
-                <w:lang w:eastAsia="de-DE"/>
               </w:rPr>
               <w:t>Titel des Job Postings</w:t>
             </w:r>
@@ -76,7 +74,6 @@
                 <w:color w:val="000000" w:themeColor="text1"/>
                 <w:sz w:val="20"/>
                 <w:szCs w:val="20"/>
-                <w:lang w:eastAsia="de-DE"/>
               </w:rPr>
             </w:pPr>
           </w:p>
@@ -101,7 +98,6 @@
                 <w:color w:val="000000" w:themeColor="text1"/>
                 <w:sz w:val="20"/>
                 <w:szCs w:val="20"/>
-                <w:lang w:eastAsia="de-DE"/>
               </w:rPr>
             </w:pPr>
           </w:p>
@@ -134,7 +130,6 @@
                 <w:color w:val="000000" w:themeColor="text1"/>
                 <w:sz w:val="20"/>
                 <w:szCs w:val="20"/>
-                <w:lang w:eastAsia="de-DE"/>
               </w:rPr>
             </w:pPr>
           </w:p>
@@ -159,7 +154,6 @@
                 <w:color w:val="000000" w:themeColor="text1"/>
                 <w:sz w:val="20"/>
                 <w:szCs w:val="20"/>
-                <w:lang w:eastAsia="de-DE"/>
               </w:rPr>
             </w:pPr>
             <w:r>
@@ -169,7 +163,6 @@
                 <w:color w:val="000000" w:themeColor="text1"/>
                 <w:sz w:val="20"/>
                 <w:szCs w:val="20"/>
-                <w:lang w:eastAsia="de-DE"/>
               </w:rPr>
               <w:t>angefragt</w:t>
             </w:r>
@@ -195,7 +188,6 @@
                 <w:color w:val="000000" w:themeColor="text1"/>
                 <w:sz w:val="20"/>
                 <w:szCs w:val="20"/>
-                <w:lang w:eastAsia="de-DE"/>
               </w:rPr>
             </w:pPr>
             <w:r>
@@ -205,7 +197,6 @@
                 <w:color w:val="000000" w:themeColor="text1"/>
                 <w:sz w:val="20"/>
                 <w:szCs w:val="20"/>
-                <w:lang w:eastAsia="de-DE"/>
               </w:rPr>
               <w:t>falls abweichend</w:t>
             </w:r>
@@ -239,7 +230,6 @@
                 <w:color w:val="000000" w:themeColor="text1"/>
                 <w:sz w:val="20"/>
                 <w:szCs w:val="20"/>
-                <w:lang w:eastAsia="de-DE"/>
               </w:rPr>
             </w:pPr>
             <w:r>
@@ -249,7 +239,6 @@
                 <w:color w:val="000000" w:themeColor="text1"/>
                 <w:sz w:val="20"/>
                 <w:szCs w:val="20"/>
-                <w:lang w:eastAsia="de-DE"/>
               </w:rPr>
               <w:t>Einkaufskurzprofil (EKP)</w:t>
             </w:r>
@@ -275,7 +264,6 @@
                 <w:color w:val="000000" w:themeColor="text1"/>
                 <w:sz w:val="20"/>
                 <w:szCs w:val="20"/>
-                <w:lang w:eastAsia="de-DE"/>
               </w:rPr>
             </w:pPr>
             <w:r>
@@ -284,7 +272,6 @@
                 <w:color w:val="000000" w:themeColor="text1"/>
                 <w:sz w:val="20"/>
                 <w:szCs w:val="20"/>
-                <w:lang w:eastAsia="de-DE"/>
               </w:rPr>
               <w:t>X|YYY|XXX|Z</w:t>
             </w:r>
@@ -310,7 +297,6 @@
                 <w:color w:val="000000" w:themeColor="text1"/>
                 <w:sz w:val="20"/>
                 <w:szCs w:val="20"/>
-                <w:lang w:eastAsia="de-DE"/>
               </w:rPr>
             </w:pPr>
             <w:r>
@@ -319,7 +305,6 @@
                 <w:color w:val="000000" w:themeColor="text1"/>
                 <w:sz w:val="20"/>
                 <w:szCs w:val="20"/>
-                <w:lang w:eastAsia="de-DE"/>
               </w:rPr>
               <w:t>X|YYY|XXX|Z</w:t>
             </w:r>
@@ -353,7 +338,6 @@
                 <w:color w:val="000000" w:themeColor="text1"/>
                 <w:sz w:val="20"/>
                 <w:szCs w:val="20"/>
-                <w:lang w:eastAsia="de-DE"/>
               </w:rPr>
             </w:pPr>
           </w:p>
@@ -370,7 +354,6 @@
                 <w:color w:val="000000" w:themeColor="text1"/>
                 <w:sz w:val="20"/>
                 <w:szCs w:val="20"/>
-                <w:lang w:eastAsia="de-DE"/>
               </w:rPr>
             </w:pPr>
             <w:r>
@@ -380,7 +363,6 @@
                 <w:color w:val="000000" w:themeColor="text1"/>
                 <w:sz w:val="20"/>
                 <w:szCs w:val="20"/>
-                <w:lang w:eastAsia="de-DE"/>
               </w:rPr>
               <w:t>Stundenverrechnungssatz (SVS)</w:t>
             </w:r>
@@ -398,7 +380,6 @@
                 <w:color w:val="000000" w:themeColor="text1"/>
                 <w:sz w:val="20"/>
                 <w:szCs w:val="20"/>
-                <w:lang w:eastAsia="de-DE"/>
               </w:rPr>
             </w:pPr>
           </w:p>
@@ -423,7 +404,6 @@
                 <w:color w:val="000000" w:themeColor="text1"/>
                 <w:sz w:val="20"/>
                 <w:szCs w:val="20"/>
-                <w:lang w:eastAsia="de-DE"/>
               </w:rPr>
             </w:pPr>
             <w:r>
@@ -433,7 +413,6 @@
                 <w:color w:val="000000" w:themeColor="text1"/>
                 <w:sz w:val="20"/>
                 <w:szCs w:val="20"/>
-                <w:lang w:eastAsia="de-DE"/>
               </w:rPr>
               <w:t xml:space="preserve"> €</w:t>
             </w:r>
@@ -459,7 +438,6 @@
                 <w:color w:val="000000" w:themeColor="text1"/>
                 <w:sz w:val="20"/>
                 <w:szCs w:val="20"/>
-                <w:lang w:eastAsia="de-DE"/>
               </w:rPr>
             </w:pPr>
           </w:p>
@@ -477,7 +455,6 @@
                 <w:color w:val="000000" w:themeColor="text1"/>
                 <w:sz w:val="20"/>
                 <w:szCs w:val="20"/>
-                <w:lang w:eastAsia="de-DE"/>
               </w:rPr>
             </w:pPr>
             <w:r>
@@ -487,7 +464,6 @@
                 <w:color w:val="000000" w:themeColor="text1"/>
                 <w:sz w:val="20"/>
                 <w:szCs w:val="20"/>
-                <w:lang w:eastAsia="de-DE"/>
               </w:rPr>
               <w:t xml:space="preserve"> €</w:t>
             </w:r>
@@ -506,7 +482,6 @@
                 <w:color w:val="000000" w:themeColor="text1"/>
                 <w:sz w:val="20"/>
                 <w:szCs w:val="20"/>
-                <w:lang w:eastAsia="de-DE"/>
               </w:rPr>
             </w:pPr>
           </w:p>
@@ -539,7 +514,6 @@
                 <w:color w:val="000000" w:themeColor="text1"/>
                 <w:sz w:val="20"/>
                 <w:szCs w:val="20"/>
-                <w:lang w:eastAsia="de-DE"/>
               </w:rPr>
             </w:pPr>
           </w:p>
@@ -556,7 +530,6 @@
                 <w:color w:val="000000" w:themeColor="text1"/>
                 <w:sz w:val="20"/>
                 <w:szCs w:val="20"/>
-                <w:lang w:eastAsia="de-DE"/>
               </w:rPr>
             </w:pPr>
             <w:r>
@@ -566,7 +539,6 @@
                 <w:color w:val="000000" w:themeColor="text1"/>
                 <w:sz w:val="20"/>
                 <w:szCs w:val="20"/>
-                <w:lang w:eastAsia="de-DE"/>
               </w:rPr>
               <w:t>Möglicher Starttermin (verfügbar ab / Kündigungsfrist)</w:t>
             </w:r>
@@ -592,7 +564,6 @@
                 <w:color w:val="000000" w:themeColor="text1"/>
                 <w:sz w:val="20"/>
                 <w:szCs w:val="20"/>
-                <w:lang w:eastAsia="de-DE"/>
               </w:rPr>
             </w:pPr>
             <w:r>
@@ -602,7 +573,6 @@
                 <w:color w:val="000000" w:themeColor="text1"/>
                 <w:sz w:val="20"/>
                 <w:szCs w:val="20"/>
-                <w:lang w:eastAsia="de-DE"/>
               </w:rPr>
               <w:t xml:space="preserve"> 1</w:t>
             </w:r>
@@ -613,7 +583,6 @@
                 <w:color w:val="000000" w:themeColor="text1"/>
                 <w:sz w:val="20"/>
                 <w:szCs w:val="20"/>
-                <w:lang w:eastAsia="de-DE"/>
               </w:rPr>
               <w:t>5</w:t>
             </w:r>
@@ -624,7 +593,6 @@
                 <w:color w:val="000000" w:themeColor="text1"/>
                 <w:sz w:val="20"/>
                 <w:szCs w:val="20"/>
-                <w:lang w:eastAsia="de-DE"/>
               </w:rPr>
               <w:t>.</w:t>
             </w:r>
@@ -635,7 +603,6 @@
                 <w:color w:val="000000" w:themeColor="text1"/>
                 <w:sz w:val="20"/>
                 <w:szCs w:val="20"/>
-                <w:lang w:eastAsia="de-DE"/>
               </w:rPr>
               <w:t>04</w:t>
             </w:r>
@@ -646,7 +613,6 @@
                 <w:color w:val="000000" w:themeColor="text1"/>
                 <w:sz w:val="20"/>
                 <w:szCs w:val="20"/>
-                <w:lang w:eastAsia="de-DE"/>
               </w:rPr>
               <w:t>.2026</w:t>
             </w:r>
@@ -671,11 +637,9 @@
           <w:rFonts w:ascii="Arial" w:hAnsi="Arial" w:cs="Arial"/>
           <w:b/>
           <w:bCs/>
-          <w:noProof/>
           <w:color w:val="000000" w:themeColor="text1"/>
           <w:sz w:val="20"/>
           <w:szCs w:val="20"/>
-          <w:lang w:eastAsia="de-DE"/>
         </w:rPr>
         <mc:AlternateContent>
           <mc:Choice Requires="wps">
@@ -956,9 +920,7 @@
                                     <w:tabs>
                                       <w:tab w:val="left" w:pos="3544"/>
                                     </w:tabs>
-                                    <w:rPr>
-                                      <w:lang w:val="en-US"/>
-                                    </w:rPr>
+                                    <w:rPr/>
                                   </w:pPr>
                                   <w:r>
                                     <w:t xml:space="preserve">Polnisch</w:t>
@@ -1377,9 +1339,7 @@
                               <w:tabs>
                                 <w:tab w:val="left" w:pos="3544"/>
                               </w:tabs>
-                              <w:rPr>
-                                <w:lang w:val="en-US"/>
-                              </w:rPr>
+                              <w:rPr/>
                             </w:pPr>
                             <w:r>
                               <w:t xml:space="preserve">Polnisch</w:t>
@@ -1582,7 +1542,6 @@
               <w:rPr>
                 <w:b/>
                 <w:bCs/>
-                <w:lang w:val="en-US"/>
               </w:rPr>
             </w:pPr>
           </w:p>
@@ -1593,19 +1552,15 @@
               <w:rPr>
                 <w:b/>
                 <w:bCs/>
-                <w:lang w:val="en-US"/>
-              </w:rPr>
-            </w:pPr>
-            <w:proofErr w:type="spellStart"/>
-            <w:r>
-              <w:rPr>
-                <w:b/>
-                <w:bCs/>
-                <w:lang w:val="en-US"/>
+              </w:rPr>
+            </w:pPr>
+            <w:r>
+              <w:rPr>
+                <w:b/>
+                <w:bCs/>
               </w:rPr>
               <w:t>Beruferfahrung</w:t>
             </w:r>
-            <w:proofErr w:type="spellEnd"/>
           </w:p>
         </w:tc>
         <w:tc>
@@ -1626,7 +1581,6 @@
                 <w:color w:val="000000" w:themeColor="text1"/>
                 <w:sz w:val="20"/>
                 <w:szCs w:val="20"/>
-                <w:lang w:val="en-US"/>
               </w:rPr>
             </w:pPr>
           </w:p>
@@ -1656,28 +1610,23 @@
                 <w:color w:val="000000" w:themeColor="text1"/>
                 <w:sz w:val="20"/>
                 <w:szCs w:val="20"/>
-                <w:lang w:val="en-US" w:eastAsia="de-DE"/>
-              </w:rPr>
-            </w:pPr>
-            <w:proofErr w:type="gramStart"/>
+              </w:rPr>
+            </w:pPr>
             <w:r>
               <w:rPr>
                 <w:rFonts w:ascii="Arial" w:hAnsi="Arial" w:cs="Arial"/>
                 <w:color w:val="000000" w:themeColor="text1"/>
                 <w:sz w:val="20"/>
                 <w:szCs w:val="20"/>
-                <w:lang w:val="en-US" w:eastAsia="de-DE"/>
               </w:rPr>
               <w:t xml:space="preserve">02/2020 – </w:t>
             </w:r>
-            <w:proofErr w:type="gramStart"/>
             <w:r>
               <w:rPr>
                 <w:rFonts w:ascii="Arial" w:hAnsi="Arial" w:cs="Arial"/>
                 <w:color w:val="000000" w:themeColor="text1"/>
                 <w:sz w:val="20"/>
                 <w:szCs w:val="20"/>
-                <w:lang w:val="en-US" w:eastAsia="de-DE"/>
               </w:rPr>
               <w:t xml:space="preserve">present</w:t>
             </w:r>
@@ -1691,7 +1640,6 @@
                 <w:color w:val="000000" w:themeColor="text1"/>
                 <w:sz w:val="20"/>
                 <w:szCs w:val="20"/>
-                <w:lang w:val="en-US"/>
               </w:rPr>
             </w:pPr>
           </w:p>
@@ -1706,56 +1654,45 @@
               <w:rPr>
                 <w:b/>
                 <w:bCs/>
-                <w:lang w:eastAsia="de-DE"/>
-              </w:rPr>
-            </w:pPr>
-            <w:r>
-              <w:rPr>
-                <w:b/>
-                <w:bCs/>
-                <w:lang w:eastAsia="de-DE"/>
+              </w:rPr>
+            </w:pPr>
+            <w:r>
+              <w:rPr>
+                <w:b/>
+                <w:bCs/>
               </w:rPr>
               <w:t>Arbeitgeber:</w:t>
             </w:r>
             <w:r>
-              <w:rPr>
-                <w:lang w:eastAsia="de-DE"/>
-              </w:rPr>
+              <w:rPr/>
               <w:t xml:space="preserve"> </w:t>
             </w:r>
             <w:r>
               <w:rPr>
                 <w:b/>
                 <w:bCs/>
-                <w:lang w:eastAsia="de-DE"/>
               </w:rPr>
               <w:t xml:space="preserve">PRIVATE COMPANY, Polen</w:t>
             </w:r>
             <w:r>
-              <w:rPr>
-                <w:lang w:eastAsia="de-DE"/>
-              </w:rPr>
+              <w:rPr/>
               <w:br/>
             </w:r>
             <w:r>
               <w:rPr>
                 <w:b/>
                 <w:bCs/>
-                <w:lang w:eastAsia="de-DE"/>
               </w:rPr>
               <w:t>Position:</w:t>
             </w:r>
             <w:r>
-              <w:rPr>
-                <w:lang w:eastAsia="de-DE"/>
-              </w:rPr>
+              <w:rPr/>
               <w:t xml:space="preserve"> </w:t>
             </w:r>
             <w:r>
               <w:rPr>
                 <w:b/>
                 <w:bCs/>
-                <w:lang w:eastAsia="de-DE"/>
               </w:rPr>
               <w:t xml:space="preserve">Schweißer</w:t>
             </w:r>
@@ -1775,15 +1712,37 @@
               <w:rPr>
                 <w:b/>
                 <w:bCs/>
-                <w:lang w:eastAsia="de-DE"/>
               </w:rPr>
               <w:t xml:space="preserve">Tätigkeit:</w:t>
             </w:r>
             <w:r>
-              <w:rPr>
-                <w:lang w:eastAsia="de-DE"/>
-              </w:rPr>
-              <w:t xml:space="preserve"> Schweißen mit 111, 135, 136 und 141 an Kohlenstoffstahl und Edelstahl, Arbeiten an Konstruktionen, Anlagen und Bauteilen mit Wandstärken von 5–40 mm nach technischen Zeichnungen.</w:t>
+              <w:rPr/>
+              <w:t xml:space="preserve"> </w:t>
+            </w:r>
+            <w:r>
+              <w:rPr/>
+              <w:br/>
+              <w:t xml:space="preserve">Schweißen mit 111</w:t>
+            </w:r>
+            <w:r>
+              <w:rPr/>
+              <w:br/>
+              <w:t xml:space="preserve">135</w:t>
+            </w:r>
+            <w:r>
+              <w:rPr/>
+              <w:br/>
+              <w:t xml:space="preserve">136 und 141 an Kohlenstoffstahl und Edelstahl</w:t>
+            </w:r>
+            <w:r>
+              <w:rPr/>
+              <w:br/>
+              <w:t xml:space="preserve">Arbeiten an Konstruktionen</w:t>
+            </w:r>
+            <w:r>
+              <w:rPr/>
+              <w:br/>
+              <w:t xml:space="preserve">Anlagen und Bauteilen mit Wandstärken von 5–40 mm nach technischen Zeichnungen.</w:t>
             </w:r>
           </w:p>
         </w:tc>
@@ -1801,28 +1760,23 @@
                 <w:color w:val="000000" w:themeColor="text1"/>
                 <w:sz w:val="20"/>
                 <w:szCs w:val="20"/>
-                <w:lang w:val="en-US" w:eastAsia="de-DE"/>
-              </w:rPr>
-            </w:pPr>
-            <w:proofErr w:type="gramStart"/>
+              </w:rPr>
+            </w:pPr>
             <w:r>
               <w:rPr>
                 <w:rFonts w:ascii="Arial" w:hAnsi="Arial" w:cs="Arial"/>
                 <w:color w:val="000000" w:themeColor="text1"/>
                 <w:sz w:val="20"/>
                 <w:szCs w:val="20"/>
-                <w:lang w:val="en-US" w:eastAsia="de-DE"/>
               </w:rPr>
               <w:t xml:space="preserve">03/2019 – </w:t>
             </w:r>
-            <w:proofErr w:type="gramStart"/>
             <w:r>
               <w:rPr>
                 <w:rFonts w:ascii="Arial" w:hAnsi="Arial" w:cs="Arial"/>
                 <w:color w:val="000000" w:themeColor="text1"/>
                 <w:sz w:val="20"/>
                 <w:szCs w:val="20"/>
-                <w:lang w:val="en-US" w:eastAsia="de-DE"/>
               </w:rPr>
               <w:t xml:space="preserve">11/2020</w:t>
             </w:r>
@@ -1836,7 +1790,6 @@
                 <w:color w:val="000000" w:themeColor="text1"/>
                 <w:sz w:val="20"/>
                 <w:szCs w:val="20"/>
-                <w:lang w:val="en-US"/>
               </w:rPr>
             </w:pPr>
           </w:p>
@@ -1851,56 +1804,45 @@
               <w:rPr>
                 <w:b/>
                 <w:bCs/>
-                <w:lang w:eastAsia="de-DE"/>
-              </w:rPr>
-            </w:pPr>
-            <w:r>
-              <w:rPr>
-                <w:b/>
-                <w:bCs/>
-                <w:lang w:eastAsia="de-DE"/>
+              </w:rPr>
+            </w:pPr>
+            <w:r>
+              <w:rPr>
+                <w:b/>
+                <w:bCs/>
               </w:rPr>
               <w:t>Arbeitgeber:</w:t>
             </w:r>
             <w:r>
-              <w:rPr>
-                <w:lang w:eastAsia="de-DE"/>
-              </w:rPr>
+              <w:rPr/>
               <w:t xml:space="preserve"> </w:t>
             </w:r>
             <w:r>
               <w:rPr>
                 <w:b/>
                 <w:bCs/>
-                <w:lang w:eastAsia="de-DE"/>
               </w:rPr>
               <w:t xml:space="preserve">GAWA ELBLĄG, Polen</w:t>
             </w:r>
             <w:r>
-              <w:rPr>
-                <w:lang w:eastAsia="de-DE"/>
-              </w:rPr>
+              <w:rPr/>
               <w:br/>
             </w:r>
             <w:r>
               <w:rPr>
                 <w:b/>
                 <w:bCs/>
-                <w:lang w:eastAsia="de-DE"/>
               </w:rPr>
               <w:t>Position:</w:t>
             </w:r>
             <w:r>
-              <w:rPr>
-                <w:lang w:eastAsia="de-DE"/>
-              </w:rPr>
+              <w:rPr/>
               <w:t xml:space="preserve"> </w:t>
             </w:r>
             <w:r>
               <w:rPr>
                 <w:b/>
                 <w:bCs/>
-                <w:lang w:eastAsia="de-DE"/>
               </w:rPr>
               <w:t xml:space="preserve">Schlosser / Schweißer</w:t>
             </w:r>
@@ -1920,15 +1862,22 @@
               <w:rPr>
                 <w:b/>
                 <w:bCs/>
-                <w:lang w:eastAsia="de-DE"/>
               </w:rPr>
               <w:t xml:space="preserve">Tätigkeit:</w:t>
             </w:r>
             <w:r>
-              <w:rPr>
-                <w:lang w:eastAsia="de-DE"/>
-              </w:rPr>
-              <w:t xml:space="preserve"> Schweißen von Stahlkonstruktionen mit 111 und 135/136, Metallbauarbeiten und Fertigung industrieller Bauteile nach technischen Vorgaben.</w:t>
+              <w:rPr/>
+              <w:t xml:space="preserve"> </w:t>
+            </w:r>
+            <w:r>
+              <w:rPr/>
+              <w:br/>
+              <w:t xml:space="preserve">Schweißen von Stahlkonstruktionen mit 111 und 135/136</w:t>
+            </w:r>
+            <w:r>
+              <w:rPr/>
+              <w:br/>
+              <w:t xml:space="preserve">Metallbauarbeiten und Fertigung industrieller Bauteile nach technischen Vorgaben.</w:t>
             </w:r>
           </w:p>
         </w:tc>
@@ -1946,28 +1895,23 @@
                 <w:color w:val="000000" w:themeColor="text1"/>
                 <w:sz w:val="20"/>
                 <w:szCs w:val="20"/>
-                <w:lang w:val="en-US" w:eastAsia="de-DE"/>
-              </w:rPr>
-            </w:pPr>
-            <w:proofErr w:type="gramStart"/>
+              </w:rPr>
+            </w:pPr>
             <w:r>
               <w:rPr>
                 <w:rFonts w:ascii="Arial" w:hAnsi="Arial" w:cs="Arial"/>
                 <w:color w:val="000000" w:themeColor="text1"/>
                 <w:sz w:val="20"/>
                 <w:szCs w:val="20"/>
-                <w:lang w:val="en-US" w:eastAsia="de-DE"/>
               </w:rPr>
               <w:t xml:space="preserve">04/2017 – </w:t>
             </w:r>
-            <w:proofErr w:type="gramStart"/>
             <w:r>
               <w:rPr>
                 <w:rFonts w:ascii="Arial" w:hAnsi="Arial" w:cs="Arial"/>
                 <w:color w:val="000000" w:themeColor="text1"/>
                 <w:sz w:val="20"/>
                 <w:szCs w:val="20"/>
-                <w:lang w:val="en-US" w:eastAsia="de-DE"/>
               </w:rPr>
               <w:t xml:space="preserve">09/2019</w:t>
             </w:r>
@@ -1981,7 +1925,6 @@
                 <w:color w:val="000000" w:themeColor="text1"/>
                 <w:sz w:val="20"/>
                 <w:szCs w:val="20"/>
-                <w:lang w:val="en-US"/>
               </w:rPr>
             </w:pPr>
           </w:p>
@@ -1996,56 +1939,45 @@
               <w:rPr>
                 <w:b/>
                 <w:bCs/>
-                <w:lang w:eastAsia="de-DE"/>
-              </w:rPr>
-            </w:pPr>
-            <w:r>
-              <w:rPr>
-                <w:b/>
-                <w:bCs/>
-                <w:lang w:eastAsia="de-DE"/>
+              </w:rPr>
+            </w:pPr>
+            <w:r>
+              <w:rPr>
+                <w:b/>
+                <w:bCs/>
               </w:rPr>
               <w:t>Arbeitgeber:</w:t>
             </w:r>
             <w:r>
-              <w:rPr>
-                <w:lang w:eastAsia="de-DE"/>
-              </w:rPr>
+              <w:rPr/>
               <w:t xml:space="preserve"> </w:t>
             </w:r>
             <w:r>
               <w:rPr>
                 <w:b/>
                 <w:bCs/>
-                <w:lang w:eastAsia="de-DE"/>
               </w:rPr>
               <w:t xml:space="preserve">Diverse Projekte</w:t>
             </w:r>
             <w:r>
-              <w:rPr>
-                <w:lang w:eastAsia="de-DE"/>
-              </w:rPr>
+              <w:rPr/>
               <w:br/>
             </w:r>
             <w:r>
               <w:rPr>
                 <w:b/>
                 <w:bCs/>
-                <w:lang w:eastAsia="de-DE"/>
               </w:rPr>
               <w:t>Position:</w:t>
             </w:r>
             <w:r>
-              <w:rPr>
-                <w:lang w:eastAsia="de-DE"/>
-              </w:rPr>
+              <w:rPr/>
               <w:t xml:space="preserve"> </w:t>
             </w:r>
             <w:r>
               <w:rPr>
                 <w:b/>
                 <w:bCs/>
-                <w:lang w:eastAsia="de-DE"/>
               </w:rPr>
               <w:t xml:space="preserve">Baggerfahrer</w:t>
             </w:r>
@@ -2065,15 +1997,22 @@
               <w:rPr>
                 <w:b/>
                 <w:bCs/>
-                <w:lang w:eastAsia="de-DE"/>
               </w:rPr>
               <w:t xml:space="preserve">Tätigkeit:</w:t>
             </w:r>
             <w:r>
-              <w:rPr>
-                <w:lang w:eastAsia="de-DE"/>
-              </w:rPr>
-              <w:t xml:space="preserve"> Bedienung von Baumaschinen im Tiefbau, Erdarbeiten und Materialbewegung.</w:t>
+              <w:rPr/>
+              <w:t xml:space="preserve"> </w:t>
+            </w:r>
+            <w:r>
+              <w:rPr/>
+              <w:br/>
+              <w:t xml:space="preserve">Bedienung von Baumaschinen im Tiefbau</w:t>
+            </w:r>
+            <w:r>
+              <w:rPr/>
+              <w:br/>
+              <w:t xml:space="preserve">Erdarbeiten und Materialbewegung.</w:t>
             </w:r>
           </w:p>
         </w:tc>
@@ -2091,28 +2030,23 @@
                 <w:color w:val="000000" w:themeColor="text1"/>
                 <w:sz w:val="20"/>
                 <w:szCs w:val="20"/>
-                <w:lang w:val="en-US" w:eastAsia="de-DE"/>
-              </w:rPr>
-            </w:pPr>
-            <w:proofErr w:type="gramStart"/>
+              </w:rPr>
+            </w:pPr>
             <w:r>
               <w:rPr>
                 <w:rFonts w:ascii="Arial" w:hAnsi="Arial" w:cs="Arial"/>
                 <w:color w:val="000000" w:themeColor="text1"/>
                 <w:sz w:val="20"/>
                 <w:szCs w:val="20"/>
-                <w:lang w:val="en-US" w:eastAsia="de-DE"/>
               </w:rPr>
               <w:t xml:space="preserve">09/2012 – </w:t>
             </w:r>
-            <w:proofErr w:type="gramStart"/>
             <w:r>
               <w:rPr>
                 <w:rFonts w:ascii="Arial" w:hAnsi="Arial" w:cs="Arial"/>
                 <w:color w:val="000000" w:themeColor="text1"/>
                 <w:sz w:val="20"/>
                 <w:szCs w:val="20"/>
-                <w:lang w:val="en-US" w:eastAsia="de-DE"/>
               </w:rPr>
               <w:t xml:space="preserve">03/2017</w:t>
             </w:r>
@@ -2126,7 +2060,6 @@
                 <w:color w:val="000000" w:themeColor="text1"/>
                 <w:sz w:val="20"/>
                 <w:szCs w:val="20"/>
-                <w:lang w:val="en-US"/>
               </w:rPr>
             </w:pPr>
           </w:p>
@@ -2141,56 +2074,45 @@
               <w:rPr>
                 <w:b/>
                 <w:bCs/>
-                <w:lang w:eastAsia="de-DE"/>
-              </w:rPr>
-            </w:pPr>
-            <w:r>
-              <w:rPr>
-                <w:b/>
-                <w:bCs/>
-                <w:lang w:eastAsia="de-DE"/>
+              </w:rPr>
+            </w:pPr>
+            <w:r>
+              <w:rPr>
+                <w:b/>
+                <w:bCs/>
               </w:rPr>
               <w:t>Arbeitgeber:</w:t>
             </w:r>
             <w:r>
-              <w:rPr>
-                <w:lang w:eastAsia="de-DE"/>
-              </w:rPr>
+              <w:rPr/>
               <w:t xml:space="preserve"> </w:t>
             </w:r>
             <w:r>
               <w:rPr>
                 <w:b/>
                 <w:bCs/>
-                <w:lang w:eastAsia="de-DE"/>
               </w:rPr>
               <w:t xml:space="preserve">Zeitpuffer / Projektpause / Transporttätigkeit</w:t>
             </w:r>
             <w:r>
-              <w:rPr>
-                <w:lang w:eastAsia="de-DE"/>
-              </w:rPr>
+              <w:rPr/>
               <w:br/>
             </w:r>
             <w:r>
               <w:rPr>
                 <w:b/>
                 <w:bCs/>
-                <w:lang w:eastAsia="de-DE"/>
               </w:rPr>
               <w:t>Position:</w:t>
             </w:r>
             <w:r>
-              <w:rPr>
-                <w:lang w:eastAsia="de-DE"/>
-              </w:rPr>
+              <w:rPr/>
               <w:t xml:space="preserve"> </w:t>
             </w:r>
             <w:r>
               <w:rPr>
                 <w:b/>
                 <w:bCs/>
-                <w:lang w:eastAsia="de-DE"/>
               </w:rPr>
               <w:t xml:space="preserve">Transportwesen</w:t>
             </w:r>
@@ -2210,15 +2132,17 @@
               <w:rPr>
                 <w:b/>
                 <w:bCs/>
-                <w:lang w:eastAsia="de-DE"/>
               </w:rPr>
               <w:t xml:space="preserve">Tätigkeit:</w:t>
             </w:r>
             <w:r>
-              <w:rPr>
-                <w:lang w:eastAsia="de-DE"/>
-              </w:rPr>
-              <w:t xml:space="preserve"> Tätigkeit im Transportwesen und Logistik.</w:t>
+              <w:rPr/>
+              <w:t xml:space="preserve"> </w:t>
+            </w:r>
+            <w:r>
+              <w:rPr/>
+              <w:br/>
+              <w:t xml:space="preserve">Tätigkeit im Transportwesen und Logistik.</w:t>
             </w:r>
           </w:p>
         </w:tc>
@@ -2236,28 +2160,23 @@
                 <w:color w:val="000000" w:themeColor="text1"/>
                 <w:sz w:val="20"/>
                 <w:szCs w:val="20"/>
-                <w:lang w:val="en-US" w:eastAsia="de-DE"/>
-              </w:rPr>
-            </w:pPr>
-            <w:proofErr w:type="gramStart"/>
+              </w:rPr>
+            </w:pPr>
             <w:r>
               <w:rPr>
                 <w:rFonts w:ascii="Arial" w:hAnsi="Arial" w:cs="Arial"/>
                 <w:color w:val="000000" w:themeColor="text1"/>
                 <w:sz w:val="20"/>
                 <w:szCs w:val="20"/>
-                <w:lang w:val="en-US" w:eastAsia="de-DE"/>
               </w:rPr>
               <w:t xml:space="preserve">01/2012 – </w:t>
             </w:r>
-            <w:proofErr w:type="gramStart"/>
             <w:r>
               <w:rPr>
                 <w:rFonts w:ascii="Arial" w:hAnsi="Arial" w:cs="Arial"/>
                 <w:color w:val="000000" w:themeColor="text1"/>
                 <w:sz w:val="20"/>
                 <w:szCs w:val="20"/>
-                <w:lang w:val="en-US" w:eastAsia="de-DE"/>
               </w:rPr>
               <w:t xml:space="preserve">08/2012</w:t>
             </w:r>
@@ -2271,7 +2190,6 @@
                 <w:color w:val="000000" w:themeColor="text1"/>
                 <w:sz w:val="20"/>
                 <w:szCs w:val="20"/>
-                <w:lang w:val="en-US"/>
               </w:rPr>
             </w:pPr>
           </w:p>
@@ -2286,56 +2204,45 @@
               <w:rPr>
                 <w:b/>
                 <w:bCs/>
-                <w:lang w:eastAsia="de-DE"/>
-              </w:rPr>
-            </w:pPr>
-            <w:r>
-              <w:rPr>
-                <w:b/>
-                <w:bCs/>
-                <w:lang w:eastAsia="de-DE"/>
+              </w:rPr>
+            </w:pPr>
+            <w:r>
+              <w:rPr>
+                <w:b/>
+                <w:bCs/>
               </w:rPr>
               <w:t>Arbeitgeber:</w:t>
             </w:r>
             <w:r>
-              <w:rPr>
-                <w:lang w:eastAsia="de-DE"/>
-              </w:rPr>
+              <w:rPr/>
               <w:t xml:space="preserve"> </w:t>
             </w:r>
             <w:r>
               <w:rPr>
                 <w:b/>
                 <w:bCs/>
-                <w:lang w:eastAsia="de-DE"/>
               </w:rPr>
               <w:t xml:space="preserve">LOYD HOLANDIA, Niederlande</w:t>
             </w:r>
             <w:r>
-              <w:rPr>
-                <w:lang w:eastAsia="de-DE"/>
-              </w:rPr>
+              <w:rPr/>
               <w:br/>
             </w:r>
             <w:r>
               <w:rPr>
                 <w:b/>
                 <w:bCs/>
-                <w:lang w:eastAsia="de-DE"/>
               </w:rPr>
               <w:t>Position:</w:t>
             </w:r>
             <w:r>
-              <w:rPr>
-                <w:lang w:eastAsia="de-DE"/>
-              </w:rPr>
+              <w:rPr/>
               <w:t xml:space="preserve"> </w:t>
             </w:r>
             <w:r>
               <w:rPr>
                 <w:b/>
                 <w:bCs/>
-                <w:lang w:eastAsia="de-DE"/>
               </w:rPr>
               <w:t xml:space="preserve">Aluminium-Schweißer</w:t>
             </w:r>
@@ -2355,15 +2262,22 @@
               <w:rPr>
                 <w:b/>
                 <w:bCs/>
-                <w:lang w:eastAsia="de-DE"/>
               </w:rPr>
               <w:t xml:space="preserve">Tätigkeit:</w:t>
             </w:r>
             <w:r>
-              <w:rPr>
-                <w:lang w:eastAsia="de-DE"/>
-              </w:rPr>
-              <w:t xml:space="preserve"> MIG-Schweißen (131) von Aluminiumkonstruktionen, Fertigung präziser Bauteile nach Zeichnung.</w:t>
+              <w:rPr/>
+              <w:t xml:space="preserve"> </w:t>
+            </w:r>
+            <w:r>
+              <w:rPr/>
+              <w:br/>
+              <w:t xml:space="preserve">MIG-Schweißen (131) von Aluminiumkonstruktionen</w:t>
+            </w:r>
+            <w:r>
+              <w:rPr/>
+              <w:br/>
+              <w:t xml:space="preserve">Fertigung präziser Bauteile nach Zeichnung.</w:t>
             </w:r>
           </w:p>
         </w:tc>
@@ -2381,28 +2295,23 @@
                 <w:color w:val="000000" w:themeColor="text1"/>
                 <w:sz w:val="20"/>
                 <w:szCs w:val="20"/>
-                <w:lang w:val="en-US" w:eastAsia="de-DE"/>
-              </w:rPr>
-            </w:pPr>
-            <w:proofErr w:type="gramStart"/>
+              </w:rPr>
+            </w:pPr>
             <w:r>
               <w:rPr>
                 <w:rFonts w:ascii="Arial" w:hAnsi="Arial" w:cs="Arial"/>
                 <w:color w:val="000000" w:themeColor="text1"/>
                 <w:sz w:val="20"/>
                 <w:szCs w:val="20"/>
-                <w:lang w:val="en-US" w:eastAsia="de-DE"/>
               </w:rPr>
               <w:t xml:space="preserve">02/2007 – </w:t>
             </w:r>
-            <w:proofErr w:type="gramStart"/>
             <w:r>
               <w:rPr>
                 <w:rFonts w:ascii="Arial" w:hAnsi="Arial" w:cs="Arial"/>
                 <w:color w:val="000000" w:themeColor="text1"/>
                 <w:sz w:val="20"/>
                 <w:szCs w:val="20"/>
-                <w:lang w:val="en-US" w:eastAsia="de-DE"/>
               </w:rPr>
               <w:t xml:space="preserve">12/2009</w:t>
             </w:r>
@@ -2416,7 +2325,6 @@
                 <w:color w:val="000000" w:themeColor="text1"/>
                 <w:sz w:val="20"/>
                 <w:szCs w:val="20"/>
-                <w:lang w:val="en-US"/>
               </w:rPr>
             </w:pPr>
           </w:p>
@@ -2431,56 +2339,45 @@
               <w:rPr>
                 <w:b/>
                 <w:bCs/>
-                <w:lang w:eastAsia="de-DE"/>
-              </w:rPr>
-            </w:pPr>
-            <w:r>
-              <w:rPr>
-                <w:b/>
-                <w:bCs/>
-                <w:lang w:eastAsia="de-DE"/>
+              </w:rPr>
+            </w:pPr>
+            <w:r>
+              <w:rPr>
+                <w:b/>
+                <w:bCs/>
               </w:rPr>
               <w:t>Arbeitgeber:</w:t>
             </w:r>
             <w:r>
-              <w:rPr>
-                <w:lang w:eastAsia="de-DE"/>
-              </w:rPr>
+              <w:rPr/>
               <w:t xml:space="preserve"> </w:t>
             </w:r>
             <w:r>
               <w:rPr>
                 <w:b/>
                 <w:bCs/>
-                <w:lang w:eastAsia="de-DE"/>
               </w:rPr>
               <w:t xml:space="preserve">ALUSHIP TECHNOLOGY, Niederlande</w:t>
             </w:r>
             <w:r>
-              <w:rPr>
-                <w:lang w:eastAsia="de-DE"/>
-              </w:rPr>
+              <w:rPr/>
               <w:br/>
             </w:r>
             <w:r>
               <w:rPr>
                 <w:b/>
                 <w:bCs/>
-                <w:lang w:eastAsia="de-DE"/>
               </w:rPr>
               <w:t>Position:</w:t>
             </w:r>
             <w:r>
-              <w:rPr>
-                <w:lang w:eastAsia="de-DE"/>
-              </w:rPr>
+              <w:rPr/>
               <w:t xml:space="preserve"> </w:t>
             </w:r>
             <w:r>
               <w:rPr>
                 <w:b/>
                 <w:bCs/>
-                <w:lang w:eastAsia="de-DE"/>
               </w:rPr>
               <w:t xml:space="preserve">Aluminium-Yacht-Schweißer</w:t>
             </w:r>
@@ -2500,15 +2397,22 @@
               <w:rPr>
                 <w:b/>
                 <w:bCs/>
-                <w:lang w:eastAsia="de-DE"/>
               </w:rPr>
               <w:t xml:space="preserve">Tätigkeit:</w:t>
             </w:r>
             <w:r>
-              <w:rPr>
-                <w:lang w:eastAsia="de-DE"/>
-              </w:rPr>
-              <w:t xml:space="preserve"> Schweißen von Aluminium-Yachten mit 141 und 131, präzise Arbeiten an Aluminiumlegierungen nach internationalen Standards.</w:t>
+              <w:rPr/>
+              <w:t xml:space="preserve"> </w:t>
+            </w:r>
+            <w:r>
+              <w:rPr/>
+              <w:br/>
+              <w:t xml:space="preserve">Schweißen von Aluminium-Yachten mit 141 und 131</w:t>
+            </w:r>
+            <w:r>
+              <w:rPr/>
+              <w:br/>
+              <w:t xml:space="preserve">präzise Arbeiten an Aluminiumlegierungen nach internationalen Standards.</w:t>
             </w:r>
           </w:p>
         </w:tc>
@@ -2526,28 +2430,23 @@
                 <w:color w:val="000000" w:themeColor="text1"/>
                 <w:sz w:val="20"/>
                 <w:szCs w:val="20"/>
-                <w:lang w:val="en-US" w:eastAsia="de-DE"/>
-              </w:rPr>
-            </w:pPr>
-            <w:proofErr w:type="gramStart"/>
+              </w:rPr>
+            </w:pPr>
             <w:r>
               <w:rPr>
                 <w:rFonts w:ascii="Arial" w:hAnsi="Arial" w:cs="Arial"/>
                 <w:color w:val="000000" w:themeColor="text1"/>
                 <w:sz w:val="20"/>
                 <w:szCs w:val="20"/>
-                <w:lang w:val="en-US" w:eastAsia="de-DE"/>
               </w:rPr>
               <w:t xml:space="preserve">06/2005 – </w:t>
             </w:r>
-            <w:proofErr w:type="gramStart"/>
             <w:r>
               <w:rPr>
                 <w:rFonts w:ascii="Arial" w:hAnsi="Arial" w:cs="Arial"/>
                 <w:color w:val="000000" w:themeColor="text1"/>
                 <w:sz w:val="20"/>
                 <w:szCs w:val="20"/>
-                <w:lang w:val="en-US" w:eastAsia="de-DE"/>
               </w:rPr>
               <w:t xml:space="preserve">01/2007</w:t>
             </w:r>
@@ -2561,7 +2460,6 @@
                 <w:color w:val="000000" w:themeColor="text1"/>
                 <w:sz w:val="20"/>
                 <w:szCs w:val="20"/>
-                <w:lang w:val="en-US"/>
               </w:rPr>
             </w:pPr>
           </w:p>
@@ -2576,56 +2474,45 @@
               <w:rPr>
                 <w:b/>
                 <w:bCs/>
-                <w:lang w:eastAsia="de-DE"/>
-              </w:rPr>
-            </w:pPr>
-            <w:r>
-              <w:rPr>
-                <w:b/>
-                <w:bCs/>
-                <w:lang w:eastAsia="de-DE"/>
+              </w:rPr>
+            </w:pPr>
+            <w:r>
+              <w:rPr>
+                <w:b/>
+                <w:bCs/>
               </w:rPr>
               <w:t>Arbeitgeber:</w:t>
             </w:r>
             <w:r>
-              <w:rPr>
-                <w:lang w:eastAsia="de-DE"/>
-              </w:rPr>
+              <w:rPr/>
               <w:t xml:space="preserve"> </w:t>
             </w:r>
             <w:r>
               <w:rPr>
                 <w:b/>
                 <w:bCs/>
-                <w:lang w:eastAsia="de-DE"/>
               </w:rPr>
               <w:t xml:space="preserve">DEC/GTAX OSTRODA, Polen</w:t>
             </w:r>
             <w:r>
-              <w:rPr>
-                <w:lang w:eastAsia="de-DE"/>
-              </w:rPr>
+              <w:rPr/>
               <w:br/>
             </w:r>
             <w:r>
               <w:rPr>
                 <w:b/>
                 <w:bCs/>
-                <w:lang w:eastAsia="de-DE"/>
               </w:rPr>
               <w:t>Position:</w:t>
             </w:r>
             <w:r>
-              <w:rPr>
-                <w:lang w:eastAsia="de-DE"/>
-              </w:rPr>
+              <w:rPr/>
               <w:t xml:space="preserve"> </w:t>
             </w:r>
             <w:r>
               <w:rPr>
                 <w:b/>
                 <w:bCs/>
-                <w:lang w:eastAsia="de-DE"/>
               </w:rPr>
               <w:t xml:space="preserve">Schweißer</w:t>
             </w:r>
@@ -2645,15 +2532,22 @@
               <w:rPr>
                 <w:b/>
                 <w:bCs/>
-                <w:lang w:eastAsia="de-DE"/>
               </w:rPr>
               <w:t xml:space="preserve">Tätigkeit:</w:t>
             </w:r>
             <w:r>
-              <w:rPr>
-                <w:lang w:eastAsia="de-DE"/>
-              </w:rPr>
-              <w:t xml:space="preserve"> MAG/MIG-Schweißen (135/136) von Gaswaggon-Rahmen, Arbeiten nach technischen Zeichnungen.</w:t>
+              <w:rPr/>
+              <w:t xml:space="preserve"> </w:t>
+            </w:r>
+            <w:r>
+              <w:rPr/>
+              <w:br/>
+              <w:t xml:space="preserve">MAG/MIG-Schweißen (135/136) von Gaswaggon-Rahmen</w:t>
+            </w:r>
+            <w:r>
+              <w:rPr/>
+              <w:br/>
+              <w:t xml:space="preserve">Arbeiten nach technischen Zeichnungen.</w:t>
             </w:r>
           </w:p>
         </w:tc>
@@ -2671,28 +2565,23 @@
                 <w:color w:val="000000" w:themeColor="text1"/>
                 <w:sz w:val="20"/>
                 <w:szCs w:val="20"/>
-                <w:lang w:val="en-US" w:eastAsia="de-DE"/>
-              </w:rPr>
-            </w:pPr>
-            <w:proofErr w:type="gramStart"/>
+              </w:rPr>
+            </w:pPr>
             <w:r>
               <w:rPr>
                 <w:rFonts w:ascii="Arial" w:hAnsi="Arial" w:cs="Arial"/>
                 <w:color w:val="000000" w:themeColor="text1"/>
                 <w:sz w:val="20"/>
                 <w:szCs w:val="20"/>
-                <w:lang w:val="en-US" w:eastAsia="de-DE"/>
               </w:rPr>
               <w:t xml:space="preserve">03/2000 – </w:t>
             </w:r>
-            <w:proofErr w:type="gramStart"/>
             <w:r>
               <w:rPr>
                 <w:rFonts w:ascii="Arial" w:hAnsi="Arial" w:cs="Arial"/>
                 <w:color w:val="000000" w:themeColor="text1"/>
                 <w:sz w:val="20"/>
                 <w:szCs w:val="20"/>
-                <w:lang w:val="en-US" w:eastAsia="de-DE"/>
               </w:rPr>
               <w:t xml:space="preserve">05/2005</w:t>
             </w:r>
@@ -2706,7 +2595,6 @@
                 <w:color w:val="000000" w:themeColor="text1"/>
                 <w:sz w:val="20"/>
                 <w:szCs w:val="20"/>
-                <w:lang w:val="en-US"/>
               </w:rPr>
             </w:pPr>
           </w:p>
@@ -2721,56 +2609,45 @@
               <w:rPr>
                 <w:b/>
                 <w:bCs/>
-                <w:lang w:eastAsia="de-DE"/>
-              </w:rPr>
-            </w:pPr>
-            <w:r>
-              <w:rPr>
-                <w:b/>
-                <w:bCs/>
-                <w:lang w:eastAsia="de-DE"/>
+              </w:rPr>
+            </w:pPr>
+            <w:r>
+              <w:rPr>
+                <w:b/>
+                <w:bCs/>
               </w:rPr>
               <w:t>Arbeitgeber:</w:t>
             </w:r>
             <w:r>
-              <w:rPr>
-                <w:lang w:eastAsia="de-DE"/>
-              </w:rPr>
+              <w:rPr/>
               <w:t xml:space="preserve"> </w:t>
             </w:r>
             <w:r>
               <w:rPr>
                 <w:b/>
                 <w:bCs/>
-                <w:lang w:eastAsia="de-DE"/>
               </w:rPr>
               <w:t xml:space="preserve">MONTSPAW SERVICE GDANSK, Polen</w:t>
             </w:r>
             <w:r>
-              <w:rPr>
-                <w:lang w:eastAsia="de-DE"/>
-              </w:rPr>
+              <w:rPr/>
               <w:br/>
             </w:r>
             <w:r>
               <w:rPr>
                 <w:b/>
                 <w:bCs/>
-                <w:lang w:eastAsia="de-DE"/>
               </w:rPr>
               <w:t>Position:</w:t>
             </w:r>
             <w:r>
-              <w:rPr>
-                <w:lang w:eastAsia="de-DE"/>
-              </w:rPr>
+              <w:rPr/>
               <w:t xml:space="preserve"> </w:t>
             </w:r>
             <w:r>
               <w:rPr>
                 <w:b/>
                 <w:bCs/>
-                <w:lang w:eastAsia="de-DE"/>
               </w:rPr>
               <w:t xml:space="preserve">Schweißer</w:t>
             </w:r>
@@ -2790,15 +2667,22 @@
               <w:rPr>
                 <w:b/>
                 <w:bCs/>
-                <w:lang w:eastAsia="de-DE"/>
               </w:rPr>
               <w:t xml:space="preserve">Tätigkeit:</w:t>
             </w:r>
             <w:r>
-              <w:rPr>
-                <w:lang w:eastAsia="de-DE"/>
-              </w:rPr>
-              <w:t xml:space="preserve"> MAG-Schweißen von Tanks, Druckbehältern und Rohrleitungen aus Kohlenstoffstahl bis 50 mm Wandstärke.</w:t>
+              <w:rPr/>
+              <w:t xml:space="preserve"> </w:t>
+            </w:r>
+            <w:r>
+              <w:rPr/>
+              <w:br/>
+              <w:t xml:space="preserve">MAG-Schweißen von Tanks</w:t>
+            </w:r>
+            <w:r>
+              <w:rPr/>
+              <w:br/>
+              <w:t xml:space="preserve">Druckbehältern und Rohrleitungen aus Kohlenstoffstahl bis 50 mm Wandstärke.</w:t>
             </w:r>
           </w:p>
         </w:tc>
@@ -2816,28 +2700,23 @@
                 <w:color w:val="000000" w:themeColor="text1"/>
                 <w:sz w:val="20"/>
                 <w:szCs w:val="20"/>
-                <w:lang w:val="en-US" w:eastAsia="de-DE"/>
-              </w:rPr>
-            </w:pPr>
-            <w:proofErr w:type="gramStart"/>
+              </w:rPr>
+            </w:pPr>
             <w:r>
               <w:rPr>
                 <w:rFonts w:ascii="Arial" w:hAnsi="Arial" w:cs="Arial"/>
                 <w:color w:val="000000" w:themeColor="text1"/>
                 <w:sz w:val="20"/>
                 <w:szCs w:val="20"/>
-                <w:lang w:val="en-US" w:eastAsia="de-DE"/>
               </w:rPr>
               <w:t xml:space="preserve">07/1998 – </w:t>
             </w:r>
-            <w:proofErr w:type="gramStart"/>
             <w:r>
               <w:rPr>
                 <w:rFonts w:ascii="Arial" w:hAnsi="Arial" w:cs="Arial"/>
                 <w:color w:val="000000" w:themeColor="text1"/>
                 <w:sz w:val="20"/>
                 <w:szCs w:val="20"/>
-                <w:lang w:val="en-US" w:eastAsia="de-DE"/>
               </w:rPr>
               <w:t xml:space="preserve">02/2000</w:t>
             </w:r>
@@ -2851,7 +2730,6 @@
                 <w:color w:val="000000" w:themeColor="text1"/>
                 <w:sz w:val="20"/>
                 <w:szCs w:val="20"/>
-                <w:lang w:val="en-US"/>
               </w:rPr>
             </w:pPr>
           </w:p>
@@ -2866,56 +2744,45 @@
               <w:rPr>
                 <w:b/>
                 <w:bCs/>
-                <w:lang w:eastAsia="de-DE"/>
-              </w:rPr>
-            </w:pPr>
-            <w:r>
-              <w:rPr>
-                <w:b/>
-                <w:bCs/>
-                <w:lang w:eastAsia="de-DE"/>
+              </w:rPr>
+            </w:pPr>
+            <w:r>
+              <w:rPr>
+                <w:b/>
+                <w:bCs/>
               </w:rPr>
               <w:t>Arbeitgeber:</w:t>
             </w:r>
             <w:r>
-              <w:rPr>
-                <w:lang w:eastAsia="de-DE"/>
-              </w:rPr>
+              <w:rPr/>
               <w:t xml:space="preserve"> </w:t>
             </w:r>
             <w:r>
               <w:rPr>
                 <w:b/>
                 <w:bCs/>
-                <w:lang w:eastAsia="de-DE"/>
               </w:rPr>
               <w:t xml:space="preserve">STOCZNIA CRIST GDANSK, Polen</w:t>
             </w:r>
             <w:r>
-              <w:rPr>
-                <w:lang w:eastAsia="de-DE"/>
-              </w:rPr>
+              <w:rPr/>
               <w:br/>
             </w:r>
             <w:r>
               <w:rPr>
                 <w:b/>
                 <w:bCs/>
-                <w:lang w:eastAsia="de-DE"/>
               </w:rPr>
               <w:t>Position:</w:t>
             </w:r>
             <w:r>
-              <w:rPr>
-                <w:lang w:eastAsia="de-DE"/>
-              </w:rPr>
+              <w:rPr/>
               <w:t xml:space="preserve"> </w:t>
             </w:r>
             <w:r>
               <w:rPr>
                 <w:b/>
                 <w:bCs/>
-                <w:lang w:eastAsia="de-DE"/>
               </w:rPr>
               <w:t xml:space="preserve">Schlosser / Schweißer</w:t>
             </w:r>
@@ -2935,15 +2802,22 @@
               <w:rPr>
                 <w:b/>
                 <w:bCs/>
-                <w:lang w:eastAsia="de-DE"/>
               </w:rPr>
               <w:t xml:space="preserve">Tätigkeit:</w:t>
             </w:r>
             <w:r>
-              <w:rPr>
-                <w:lang w:eastAsia="de-DE"/>
-              </w:rPr>
-              <w:t xml:space="preserve"> Schweißarbeiten im Schiffbau, Herstellung und Montage von Stahlkonstruktionen nach Zeichnung.</w:t>
+              <w:rPr/>
+              <w:t xml:space="preserve"> </w:t>
+            </w:r>
+            <w:r>
+              <w:rPr/>
+              <w:br/>
+              <w:t xml:space="preserve">Schweißarbeiten im Schiffbau</w:t>
+            </w:r>
+            <w:r>
+              <w:rPr/>
+              <w:br/>
+              <w:t xml:space="preserve">Herstellung und Montage von Stahlkonstruktionen nach Zeichnung.</w:t>
             </w:r>
           </w:p>
         </w:tc>
@@ -2961,28 +2835,23 @@
                 <w:color w:val="000000" w:themeColor="text1"/>
                 <w:sz w:val="20"/>
                 <w:szCs w:val="20"/>
-                <w:lang w:val="en-US" w:eastAsia="de-DE"/>
-              </w:rPr>
-            </w:pPr>
-            <w:proofErr w:type="gramStart"/>
+              </w:rPr>
+            </w:pPr>
             <w:r>
               <w:rPr>
                 <w:rFonts w:ascii="Arial" w:hAnsi="Arial" w:cs="Arial"/>
                 <w:color w:val="000000" w:themeColor="text1"/>
                 <w:sz w:val="20"/>
                 <w:szCs w:val="20"/>
-                <w:lang w:val="en-US" w:eastAsia="de-DE"/>
               </w:rPr>
               <w:t xml:space="preserve">04/1996 – </w:t>
             </w:r>
-            <w:proofErr w:type="gramStart"/>
             <w:r>
               <w:rPr>
                 <w:rFonts w:ascii="Arial" w:hAnsi="Arial" w:cs="Arial"/>
                 <w:color w:val="000000" w:themeColor="text1"/>
                 <w:sz w:val="20"/>
                 <w:szCs w:val="20"/>
-                <w:lang w:val="en-US" w:eastAsia="de-DE"/>
               </w:rPr>
               <w:t xml:space="preserve">06/1998</w:t>
             </w:r>
@@ -2996,7 +2865,6 @@
                 <w:color w:val="000000" w:themeColor="text1"/>
                 <w:sz w:val="20"/>
                 <w:szCs w:val="20"/>
-                <w:lang w:val="en-US"/>
               </w:rPr>
             </w:pPr>
           </w:p>
@@ -3011,56 +2879,45 @@
               <w:rPr>
                 <w:b/>
                 <w:bCs/>
-                <w:lang w:eastAsia="de-DE"/>
-              </w:rPr>
-            </w:pPr>
-            <w:r>
-              <w:rPr>
-                <w:b/>
-                <w:bCs/>
-                <w:lang w:eastAsia="de-DE"/>
+              </w:rPr>
+            </w:pPr>
+            <w:r>
+              <w:rPr>
+                <w:b/>
+                <w:bCs/>
               </w:rPr>
               <w:t>Arbeitgeber:</w:t>
             </w:r>
             <w:r>
-              <w:rPr>
-                <w:lang w:eastAsia="de-DE"/>
-              </w:rPr>
+              <w:rPr/>
               <w:t xml:space="preserve"> </w:t>
             </w:r>
             <w:r>
               <w:rPr>
                 <w:b/>
                 <w:bCs/>
-                <w:lang w:eastAsia="de-DE"/>
               </w:rPr>
               <w:t xml:space="preserve">MARITIM GDANSK, Polen</w:t>
             </w:r>
             <w:r>
-              <w:rPr>
-                <w:lang w:eastAsia="de-DE"/>
-              </w:rPr>
+              <w:rPr/>
               <w:br/>
             </w:r>
             <w:r>
               <w:rPr>
                 <w:b/>
                 <w:bCs/>
-                <w:lang w:eastAsia="de-DE"/>
               </w:rPr>
               <w:t>Position:</w:t>
             </w:r>
             <w:r>
-              <w:rPr>
-                <w:lang w:eastAsia="de-DE"/>
-              </w:rPr>
+              <w:rPr/>
               <w:t xml:space="preserve"> </w:t>
             </w:r>
             <w:r>
               <w:rPr>
                 <w:b/>
                 <w:bCs/>
-                <w:lang w:eastAsia="de-DE"/>
               </w:rPr>
               <w:t xml:space="preserve">Schlosser / Schweißer</w:t>
             </w:r>
@@ -3080,15 +2937,17 @@
               <w:rPr>
                 <w:b/>
                 <w:bCs/>
-                <w:lang w:eastAsia="de-DE"/>
               </w:rPr>
               <w:t xml:space="preserve">Tätigkeit:</w:t>
             </w:r>
             <w:r>
-              <w:rPr>
-                <w:lang w:eastAsia="de-DE"/>
-              </w:rPr>
-              <w:t xml:space="preserve"> Schweißen und Montage von Schiffbaukomponenten mit 111 und 135/136.</w:t>
+              <w:rPr/>
+              <w:t xml:space="preserve"> </w:t>
+            </w:r>
+            <w:r>
+              <w:rPr/>
+              <w:br/>
+              <w:t xml:space="preserve">Schweißen und Montage von Schiffbaukomponenten mit 111 und 135/136.</w:t>
             </w:r>
           </w:p>
         </w:tc>
@@ -3106,28 +2965,23 @@
                 <w:color w:val="000000" w:themeColor="text1"/>
                 <w:sz w:val="20"/>
                 <w:szCs w:val="20"/>
-                <w:lang w:val="en-US" w:eastAsia="de-DE"/>
-              </w:rPr>
-            </w:pPr>
-            <w:proofErr w:type="gramStart"/>
+              </w:rPr>
+            </w:pPr>
             <w:r>
               <w:rPr>
                 <w:rFonts w:ascii="Arial" w:hAnsi="Arial" w:cs="Arial"/>
                 <w:color w:val="000000" w:themeColor="text1"/>
                 <w:sz w:val="20"/>
                 <w:szCs w:val="20"/>
-                <w:lang w:val="en-US" w:eastAsia="de-DE"/>
               </w:rPr>
               <w:t xml:space="preserve">01/1988 – </w:t>
             </w:r>
-            <w:proofErr w:type="gramStart"/>
             <w:r>
               <w:rPr>
                 <w:rFonts w:ascii="Arial" w:hAnsi="Arial" w:cs="Arial"/>
                 <w:color w:val="000000" w:themeColor="text1"/>
                 <w:sz w:val="20"/>
                 <w:szCs w:val="20"/>
-                <w:lang w:val="en-US" w:eastAsia="de-DE"/>
               </w:rPr>
               <w:t xml:space="preserve">03/1991</w:t>
             </w:r>
@@ -3141,7 +2995,6 @@
                 <w:color w:val="000000" w:themeColor="text1"/>
                 <w:sz w:val="20"/>
                 <w:szCs w:val="20"/>
-                <w:lang w:val="en-US"/>
               </w:rPr>
             </w:pPr>
           </w:p>
@@ -3156,56 +3009,45 @@
               <w:rPr>
                 <w:b/>
                 <w:bCs/>
-                <w:lang w:eastAsia="de-DE"/>
-              </w:rPr>
-            </w:pPr>
-            <w:r>
-              <w:rPr>
-                <w:b/>
-                <w:bCs/>
-                <w:lang w:eastAsia="de-DE"/>
+              </w:rPr>
+            </w:pPr>
+            <w:r>
+              <w:rPr>
+                <w:b/>
+                <w:bCs/>
               </w:rPr>
               <w:t>Arbeitgeber:</w:t>
             </w:r>
             <w:r>
-              <w:rPr>
-                <w:lang w:eastAsia="de-DE"/>
-              </w:rPr>
+              <w:rPr/>
               <w:t xml:space="preserve"> </w:t>
             </w:r>
             <w:r>
               <w:rPr>
                 <w:b/>
                 <w:bCs/>
-                <w:lang w:eastAsia="de-DE"/>
               </w:rPr>
               <w:t xml:space="preserve">ELZAM ELBLĄG, Polen</w:t>
             </w:r>
             <w:r>
-              <w:rPr>
-                <w:lang w:eastAsia="de-DE"/>
-              </w:rPr>
+              <w:rPr/>
               <w:br/>
             </w:r>
             <w:r>
               <w:rPr>
                 <w:b/>
                 <w:bCs/>
-                <w:lang w:eastAsia="de-DE"/>
               </w:rPr>
               <w:t>Position:</w:t>
             </w:r>
             <w:r>
-              <w:rPr>
-                <w:lang w:eastAsia="de-DE"/>
-              </w:rPr>
+              <w:rPr/>
               <w:t xml:space="preserve"> </w:t>
             </w:r>
             <w:r>
               <w:rPr>
                 <w:b/>
                 <w:bCs/>
-                <w:lang w:eastAsia="de-DE"/>
               </w:rPr>
               <w:t xml:space="preserve">Schlosser / Schweißer</w:t>
             </w:r>
@@ -3225,15 +3067,27 @@
               <w:rPr>
                 <w:b/>
                 <w:bCs/>
-                <w:lang w:eastAsia="de-DE"/>
               </w:rPr>
               <w:t xml:space="preserve">Tätigkeit:</w:t>
             </w:r>
             <w:r>
-              <w:rPr>
-                <w:lang w:eastAsia="de-DE"/>
-              </w:rPr>
-              <w:t xml:space="preserve"> Metallbau, Herstellung von Stahlkonstruktionen, Toren und Geländern.</w:t>
+              <w:rPr/>
+              <w:t xml:space="preserve"> </w:t>
+            </w:r>
+            <w:r>
+              <w:rPr/>
+              <w:br/>
+              <w:t xml:space="preserve">Metallbau</w:t>
+            </w:r>
+            <w:r>
+              <w:rPr/>
+              <w:br/>
+              <w:t xml:space="preserve">Herstellung von Stahlkonstruktionen</w:t>
+            </w:r>
+            <w:r>
+              <w:rPr/>
+              <w:br/>
+              <w:t xml:space="preserve">Toren und Geländern.</w:t>
             </w:r>
           </w:p>
         </w:tc>
@@ -3267,7 +3121,6 @@
           <w:rFonts w:asciiTheme="minorHAnsi" w:hAnsiTheme="minorHAnsi" w:cstheme="minorHAnsi"/>
           <w:sz w:val="22"/>
           <w:szCs w:val="22"/>
-          <w:lang w:val="en-US"/>
         </w:rPr>
       </w:pPr>
       <w:r>
@@ -3275,11 +3128,9 @@
           <w:rFonts w:asciiTheme="minorHAnsi" w:hAnsiTheme="minorHAnsi" w:cstheme="minorHAnsi"/>
           <w:sz w:val="22"/>
           <w:szCs w:val="22"/>
-          <w:lang w:val="en-US"/>
         </w:rPr>
         <w:t xml:space="preserve"/>
       </w:r>
-      <w:proofErr w:type="gramEnd"/>
     </w:p>
     <w:p>
       <w:pPr>
@@ -3306,8 +3157,91 @@
         <w:tblLayout w:type="fixed"/>
         <w:tblLook w:val="04A0" w:firstRow="1" w:lastRow="0" w:firstColumn="1" w:lastColumn="0" w:noHBand="0" w:noVBand="1"/>
       </w:tblPr>
-      <w:tblGrid/>
-      {'years': '1983-1988', 'jahre': '1983-1988', 'institution': 'Zespół Szkół Zawodowych w Iławie, Polen', 'einrichtung': 'Zespół Szkół Zawodowych w Iławie, Polen', 'field': 'Metallbearbeitung / Schweißtechnik', 'abschluss': 'Metallbearbeitung / Schweißtechnik', 'kurs': 'Metallbearbeitung / Schweißtechnik'}
+      <w:tblGrid>
+        <w:gridCol w:w="2122"/>
+        <w:gridCol w:w="6940"/>
+      </w:tblGrid>
+      <w:tr>
+        <w:tc>
+          <w:tcPr>
+            <w:tcW w:w="2122" w:type="dxa"/>
+            <w:tcBorders>
+              <w:top w:val="single" w:sz="4" w:space="0" w:color="auto"/>
+              <w:left w:val="single" w:sz="4" w:space="0" w:color="auto"/>
+              <w:bottom w:val="single" w:sz="4" w:space="0" w:color="auto"/>
+              <w:right w:val="single" w:sz="4" w:space="0" w:color="auto"/>
+            </w:tcBorders>
+          </w:tcPr>
+          <w:p>
+            <w:pPr>
+              <w:pStyle w:val="PlainText"/>
+              <w:rPr>
+                <w:rFonts w:asciiTheme="minorHAnsi" w:hAnsiTheme="minorHAnsi" w:cstheme="minorHAnsi"/>
+                <w:sz w:val="22"/>
+                <w:szCs w:val="22"/>
+              </w:rPr>
+            </w:pPr>
+            <w:r>
+              <w:rPr>
+                <w:rFonts w:asciiTheme="minorHAnsi" w:hAnsiTheme="minorHAnsi" w:cstheme="minorHAnsi"/>
+                <w:sz w:val="22"/>
+                <w:szCs w:val="22"/>
+              </w:rPr>
+              <w:t xml:space="preserve">1983-1988:</w:t>
+            </w:r>
+          </w:p>
+          <w:p>
+            <w:pPr>
+              <w:pStyle w:val="PlainText"/>
+              <w:rPr>
+                <w:rFonts w:asciiTheme="minorHAnsi" w:hAnsiTheme="minorHAnsi" w:cstheme="minorHAnsi"/>
+                <w:sz w:val="22"/>
+                <w:szCs w:val="22"/>
+              </w:rPr>
+            </w:pPr>
+          </w:p>
+        </w:tc>
+        <w:tc>
+          <w:tcPr>
+            <w:tcW w:w="6940" w:type="dxa"/>
+            <w:tcBorders>
+              <w:top w:val="single" w:sz="4" w:space="0" w:color="auto"/>
+              <w:left w:val="single" w:sz="4" w:space="0" w:color="auto"/>
+              <w:bottom w:val="single" w:sz="4" w:space="0" w:color="auto"/>
+              <w:right w:val="single" w:sz="4" w:space="0" w:color="auto"/>
+            </w:tcBorders>
+          </w:tcPr>
+          <w:p>
+            <w:pPr>
+              <w:pStyle w:val="PlainText"/>
+              <w:rPr>
+                <w:rFonts w:asciiTheme="minorHAnsi" w:hAnsiTheme="minorHAnsi" w:cstheme="minorHAnsi"/>
+                <w:sz w:val="22"/>
+                <w:szCs w:val="22"/>
+              </w:rPr>
+            </w:pPr>
+            <w:r>
+              <w:rPr>
+                <w:rFonts w:asciiTheme="minorHAnsi" w:hAnsiTheme="minorHAnsi" w:cstheme="minorHAnsi"/>
+                <w:sz w:val="22"/>
+                <w:szCs w:val="22"/>
+              </w:rPr>
+              <w:lastRenderedPageBreak/>
+              <w:t xml:space="preserve">Zespół Szkół Zawodowych w Iławie, Polen – Berufsausbildung Metallbearbeitung / Schweißtechnik</w:t>
+            </w:r>
+          </w:p>
+          <w:p>
+            <w:pPr>
+              <w:pStyle w:val="PlainText"/>
+              <w:rPr>
+                <w:rFonts w:asciiTheme="minorHAnsi" w:hAnsiTheme="minorHAnsi" w:cstheme="minorHAnsi"/>
+                <w:sz w:val="22"/>
+                <w:szCs w:val="22"/>
+              </w:rPr>
+            </w:pPr>
+          </w:p>
+        </w:tc>
+      </w:tr>
     </w:tbl>
     <w:p>
       <w:pPr>
@@ -3316,7 +3250,6 @@
           <w:rFonts w:asciiTheme="minorHAnsi" w:hAnsiTheme="minorHAnsi" w:cstheme="minorHAnsi"/>
           <w:sz w:val="22"/>
           <w:szCs w:val="22"/>
-          <w:lang w:val="en-US"/>
         </w:rPr>
       </w:pPr>
       <w:r>
@@ -3324,7 +3257,6 @@
           <w:rFonts w:asciiTheme="minorHAnsi" w:hAnsiTheme="minorHAnsi" w:cstheme="minorHAnsi"/>
           <w:sz w:val="22"/>
           <w:szCs w:val="22"/>
-          <w:lang w:val="en-US"/>
         </w:rPr>
         <w:t xml:space="preserve"/>
       </w:r>
@@ -3336,7 +3268,6 @@
           <w:rFonts w:asciiTheme="minorHAnsi" w:hAnsiTheme="minorHAnsi" w:cstheme="minorHAnsi"/>
           <w:sz w:val="22"/>
           <w:szCs w:val="22"/>
-          <w:lang w:val="en-US"/>
         </w:rPr>
       </w:pPr>
       <w:r>
@@ -3344,11 +3275,9 @@
           <w:rFonts w:asciiTheme="minorHAnsi" w:hAnsiTheme="minorHAnsi" w:cstheme="minorHAnsi"/>
           <w:sz w:val="22"/>
           <w:szCs w:val="22"/>
-          <w:lang w:val="en-US"/>
         </w:rPr>
         <w:t xml:space="preserve"/>
       </w:r>
-      <w:proofErr w:type="gramEnd"/>
     </w:p>
     <w:p>
       <w:pPr>
@@ -3357,7 +3286,6 @@
           <w:rFonts w:asciiTheme="minorHAnsi" w:hAnsiTheme="minorHAnsi" w:cstheme="minorHAnsi"/>
           <w:sz w:val="22"/>
           <w:szCs w:val="22"/>
-          <w:lang w:val="en-US"/>
         </w:rPr>
       </w:pPr>
     </w:p>
@@ -3368,7 +3296,6 @@
           <w:rFonts w:asciiTheme="minorHAnsi" w:hAnsiTheme="minorHAnsi" w:cstheme="minorHAnsi"/>
           <w:sz w:val="22"/>
           <w:szCs w:val="22"/>
-          <w:lang w:val="en-US"/>
         </w:rPr>
       </w:pPr>
       <w:r>
@@ -3376,7 +3303,6 @@
           <w:rFonts w:asciiTheme="minorHAnsi" w:hAnsiTheme="minorHAnsi" w:cstheme="minorHAnsi"/>
           <w:sz w:val="22"/>
           <w:szCs w:val="22"/>
-          <w:lang w:val="en-US"/>
         </w:rPr>
         <w:t xml:space="preserve">WEITERBILDUNG:</w:t>
       </w:r>
@@ -3388,8 +3314,90 @@
         <w:tblLayout w:type="fixed"/>
         <w:tblLook w:val="04A0" w:firstRow="1" w:lastRow="0" w:firstColumn="1" w:lastColumn="0" w:noHBand="0" w:noVBand="1"/>
       </w:tblPr>
-      <w:tblGrid/>
-      {'years': '', 'jahre': '', 'institution': '', 'einrichtung': '', 'field': 'Schweißzertifikate für Verfahren 111, 131, 135, 136, 138, 141', 'abschluss': 'Schweißzertifikate für Verfahren 111, 131, 135, 136, 138, 141', 'kurs': 'Schweißzertifikate für Verfahren 111, 131, 135, 136, 138, 141'}
+      <w:tblGrid>
+        <w:gridCol w:w="2122"/>
+        <w:gridCol w:w="6940"/>
+      </w:tblGrid>
+      <w:tr>
+        <w:tc>
+          <w:tcPr>
+            <w:tcW w:w="2122" w:type="dxa"/>
+            <w:tcBorders>
+              <w:top w:val="single" w:sz="4" w:space="0" w:color="auto"/>
+              <w:left w:val="single" w:sz="4" w:space="0" w:color="auto"/>
+              <w:bottom w:val="single" w:sz="4" w:space="0" w:color="auto"/>
+              <w:right w:val="single" w:sz="4" w:space="0" w:color="auto"/>
+            </w:tcBorders>
+          </w:tcPr>
+          <w:p>
+            <w:pPr>
+              <w:pStyle w:val="PlainText"/>
+              <w:rPr>
+                <w:rFonts w:asciiTheme="minorHAnsi" w:hAnsiTheme="minorHAnsi" w:cstheme="minorHAnsi"/>
+                <w:sz w:val="22"/>
+                <w:szCs w:val="22"/>
+              </w:rPr>
+            </w:pPr>
+            <w:r>
+              <w:rPr>
+                <w:rFonts w:asciiTheme="minorHAnsi" w:hAnsiTheme="minorHAnsi" w:cstheme="minorHAnsi"/>
+                <w:sz w:val="22"/>
+                <w:szCs w:val="22"/>
+              </w:rPr>
+              <w:t xml:space="preserve">2020:</w:t>
+            </w:r>
+          </w:p>
+          <w:p>
+            <w:pPr>
+              <w:pStyle w:val="PlainText"/>
+              <w:rPr>
+                <w:rFonts w:asciiTheme="minorHAnsi" w:hAnsiTheme="minorHAnsi" w:cstheme="minorHAnsi"/>
+                <w:sz w:val="22"/>
+                <w:szCs w:val="22"/>
+              </w:rPr>
+            </w:pPr>
+          </w:p>
+        </w:tc>
+        <w:tc>
+          <w:tcPr>
+            <w:tcW w:w="6940" w:type="dxa"/>
+            <w:tcBorders>
+              <w:top w:val="single" w:sz="4" w:space="0" w:color="auto"/>
+              <w:left w:val="single" w:sz="4" w:space="0" w:color="auto"/>
+              <w:bottom w:val="single" w:sz="4" w:space="0" w:color="auto"/>
+              <w:right w:val="single" w:sz="4" w:space="0" w:color="auto"/>
+            </w:tcBorders>
+          </w:tcPr>
+          <w:p>
+            <w:pPr>
+              <w:pStyle w:val="PlainText"/>
+              <w:rPr>
+                <w:rFonts w:asciiTheme="minorHAnsi" w:hAnsiTheme="minorHAnsi" w:cstheme="minorHAnsi"/>
+                <w:sz w:val="22"/>
+                <w:szCs w:val="22"/>
+              </w:rPr>
+            </w:pPr>
+            <w:r>
+              <w:rPr>
+                <w:rFonts w:asciiTheme="minorHAnsi" w:hAnsiTheme="minorHAnsi" w:cstheme="minorHAnsi"/>
+                <w:sz w:val="22"/>
+                <w:szCs w:val="22"/>
+              </w:rPr>
+              <w:t xml:space="preserve">Diverse Anbieter – Schweißkurse Verfahren: 111, 131, 135, 136, 138, 141</w:t>
+            </w:r>
+          </w:p>
+          <w:p>
+            <w:pPr>
+              <w:pStyle w:val="PlainText"/>
+              <w:rPr>
+                <w:rFonts w:asciiTheme="minorHAnsi" w:hAnsiTheme="minorHAnsi" w:cstheme="minorHAnsi"/>
+                <w:sz w:val="22"/>
+                <w:szCs w:val="22"/>
+              </w:rPr>
+            </w:pPr>
+          </w:p>
+        </w:tc>
+      </w:tr>
     </w:tbl>
     <w:p>
       <w:pPr>
@@ -3567,9 +3575,7 @@
                     <w:spacing w:line="276" w:lineRule="auto"/>
                   </w:pPr>
                   <w:r>
-                    <w:rPr>
-                      <w:noProof/>
-                    </w:rPr>
+                    <w:rPr/>
                     <mc:AlternateContent>
                       <mc:Choice Requires="wps">
                         <w:drawing>
@@ -4184,7 +4190,6 @@
                       <w:color w:val="000000" w:themeColor="text1"/>
                       <w:sz w:val="20"/>
                       <w:szCs w:val="20"/>
-                      <w:lang w:eastAsia="de-DE"/>
                     </w:rPr>
                   </w:pPr>
                 </w:p>
@@ -4212,7 +4217,6 @@
                       <w:color w:val="000000" w:themeColor="text1"/>
                       <w:sz w:val="20"/>
                       <w:szCs w:val="20"/>
-                      <w:lang w:eastAsia="de-DE"/>
                     </w:rPr>
                   </w:pPr>
                 </w:p>
@@ -4264,15 +4268,10 @@
           <w:p>
             <w:pPr>
               <w:pStyle w:val="NoSpacing"/>
-              <w:rPr>
-                <w:lang w:val="en-US"/>
-              </w:rPr>
-            </w:pPr>
-            <w:proofErr w:type="gramStart"/>
-            <w:r>
-              <w:rPr>
-                <w:lang w:val="en-US"/>
-              </w:rPr>
+              <w:rPr/>
+            </w:pPr>
+            <w:r>
+              <w:rPr/>
               <w:t xml:space="preserve">Polnisch:</w:t>
             </w:r>
           </w:p>
@@ -4284,15 +4283,10 @@
           <w:p>
             <w:pPr>
               <w:pStyle w:val="NoSpacing"/>
-              <w:rPr>
-                <w:lang w:val="en-US"/>
-              </w:rPr>
-            </w:pPr>
-            <w:proofErr w:type="gramStart"/>
-            <w:r>
-              <w:rPr>
-                <w:lang w:val="en-US"/>
-              </w:rPr>
+              <w:rPr/>
+            </w:pPr>
+            <w:r>
+              <w:rPr/>
               <w:t xml:space="preserve">Muttersprache</w:t>
             </w:r>
           </w:p>
@@ -4306,15 +4300,10 @@
           <w:p>
             <w:pPr>
               <w:pStyle w:val="NoSpacing"/>
-              <w:rPr>
-                <w:lang w:val="en-US"/>
-              </w:rPr>
-            </w:pPr>
-            <w:proofErr w:type="gramStart"/>
-            <w:r>
-              <w:rPr>
-                <w:lang w:val="en-US"/>
-              </w:rPr>
+              <w:rPr/>
+            </w:pPr>
+            <w:r>
+              <w:rPr/>
               <w:t xml:space="preserve">Deutsch:</w:t>
             </w:r>
           </w:p>
@@ -4326,15 +4315,10 @@
           <w:p>
             <w:pPr>
               <w:pStyle w:val="NoSpacing"/>
-              <w:rPr>
-                <w:lang w:val="en-US"/>
-              </w:rPr>
-            </w:pPr>
-            <w:proofErr w:type="gramStart"/>
-            <w:r>
-              <w:rPr>
-                <w:lang w:val="en-US"/>
-              </w:rPr>
+              <w:rPr/>
+            </w:pPr>
+            <w:r>
+              <w:rPr/>
               <w:t xml:space="preserve">B1</w:t>
             </w:r>
           </w:p>
@@ -4348,15 +4332,10 @@
           <w:p>
             <w:pPr>
               <w:pStyle w:val="NoSpacing"/>
-              <w:rPr>
-                <w:lang w:val="en-US"/>
-              </w:rPr>
-            </w:pPr>
-            <w:proofErr w:type="gramStart"/>
-            <w:r>
-              <w:rPr>
-                <w:lang w:val="en-US"/>
-              </w:rPr>
+              <w:rPr/>
+            </w:pPr>
+            <w:r>
+              <w:rPr/>
               <w:t xml:space="preserve">Englisch:</w:t>
             </w:r>
           </w:p>
@@ -4368,15 +4347,10 @@
           <w:p>
             <w:pPr>
               <w:pStyle w:val="NoSpacing"/>
-              <w:rPr>
-                <w:lang w:val="en-US"/>
-              </w:rPr>
-            </w:pPr>
-            <w:proofErr w:type="gramStart"/>
-            <w:r>
-              <w:rPr>
-                <w:lang w:val="en-US"/>
-              </w:rPr>
+              <w:rPr/>
+            </w:pPr>
+            <w:r>
+              <w:rPr/>
               <w:t xml:space="preserve">A2</w:t>
             </w:r>
           </w:p>
@@ -4392,7 +4366,6 @@
           <w:color w:val="000000" w:themeColor="text1"/>
           <w:sz w:val="20"/>
           <w:szCs w:val="20"/>
-          <w:lang w:val="en-US"/>
         </w:rPr>
       </w:pPr>
     </w:p>

</xml_diff>